<commit_message>
Paper: drop the running title from the header and list the base paper first
Only the page number stays in the header. DEFAME is now reference 1;
the rest are numbered by first citation.
</commit_message>
<xml_diff>
--- a/docs/paper/NICOM_Paper_CO5.docx
+++ b/docs/paper/NICOM_Paper_CO5.docx
@@ -206,7 +206,7 @@
           <w:i w:val="0"/>
           <w:sz w:val="24"/>
         </w:rPr>
-        <w:t>, the World Economic Forum ranked misinformation and disinformation as the second most severe global risk over the next two years, just behind geoeconomic confrontation [1]. False stories also travel further and faster than true ones on social media [2]. Most people meet them as a forwarded message, a screenshot or a link, with no easy way to check where they came from.</w:t>
+        <w:t>, the World Economic Forum ranked misinformation and disinformation as the second most severe global risk over the next two years, just behind geoeconomic confrontation [2]. False stories also travel further and faster than true ones on social media [3]. Most people meet them as a forwarded message, a screenshot or a link, with no easy way to check where they came from.</w:t>
       </w:r>
     </w:p>
     <w:p>
@@ -224,7 +224,7 @@
           <w:i w:val="0"/>
           <w:sz w:val="24"/>
         </w:rPr>
-        <w:t>Automated detectors are supposed to help with that. Most of them treat the problem as text classification: a model reads the article and labels it fake or real from its wording. Scores on public datasets are high. On ISOT [3], accuracies above 99% are common, but an audit by Verma [4] traced much of that to the way the corpus was put together. There is a simpler problem too. A style-based detector rewards features that the writer controls. Anyone fabricating a story can keep the headline calm, quote named officials and avoid loaded words. Chen and Shu [5] found that misinformation rewritten by a language model is harder for both people and detectors to catch than the human-written version with the same meaning.</w:t>
+        <w:t>Automated detectors are supposed to help with that. Most of them treat the problem as text classification: a model reads the article and labels it fake or real from its wording. Scores on public datasets are high. On ISOT [4], accuracies above 99% are common, but an audit by Verma [5] traced much of that to the way the corpus was put together. There is a simpler problem too. A style-based detector rewards features that the writer controls. Anyone fabricating a story can keep the headline calm, quote named officials and avoid loaded words. Chen and Shu [6] found that misinformation rewritten by a language model is harder for both people and detectors to catch than the human-written version with the same meaning.</w:t>
       </w:r>
     </w:p>
     <w:p>
@@ -278,7 +278,7 @@
           <w:i w:val="0"/>
           <w:sz w:val="24"/>
         </w:rPr>
-        <w:t>Our base paper is DEFAME [6], a fact-checking system published at ICML 2025 that plans web searches, gathers text and image evidence and writes a justified verdict. We keep its evidence-first approach and add four things a public tool needs: limits on what each kind of evidence may prove, a count of independent sources, a check on who published the page, and defined behaviour when a check fails. We also measured which language-model tasks can run on a local model, and nine of ten can.</w:t>
+        <w:t>Our base paper is DEFAME [1], a fact-checking system published at ICML 2025 that plans web searches, gathers text and image evidence and writes a justified verdict. We keep its evidence-first approach and add four things a public tool needs: limits on what each kind of evidence may prove, a count of independent sources, a check on who published the page, and defined behaviour when a check fails. We also measured which language-model tasks can run on a local model, and nine of ten can.</w:t>
       </w:r>
     </w:p>
     <w:p>
@@ -335,7 +335,7 @@
           <w:i w:val="0"/>
           <w:sz w:val="24"/>
         </w:rPr>
-        <w:t>Content-based detectors classify the article text. Ahmed et al. [3] built ISOT from Reuters stories and from articles flagged by fact-checkers and trained n-gram classifiers on it. Shu et al. [7] added explanations with dEFEND, which attends to article sentences and user comments together and shows the comments that point most strongly to deception. It needs those comments, though, and an article that has just been forwarded to someone has none. Da San Martino et al. [8] defined a span-level taxonomy of persuasion techniques for SemEval-2020, which we use for one of our writing checks.</w:t>
+        <w:t>Content-based detectors classify the article text. Ahmed et al. [4] built ISOT from Reuters stories and from articles flagged by fact-checkers and trained n-gram classifiers on it. Shu et al. [7] added explanations with dEFEND, which attends to article sentences and user comments together and shows the comments that point most strongly to deception. It needs those comments, though, and an article that has just been forwarded to someone has none. Da San Martino et al. [8] defined a span-level taxonomy of persuasion techniques for SemEval-2020, which we use for one of our writing checks.</w:t>
       </w:r>
     </w:p>
     <w:p>
@@ -389,7 +389,7 @@
           <w:i w:val="0"/>
           <w:sz w:val="24"/>
         </w:rPr>
-        <w:t>DEFAME [6] is the closest system to ours. It runs in six stages (plan, execute, summarise, develop the fact-check, predict, justify), uses web search, image search, reverse image search and a geolocation tool, and returns supported, refuted, misleading or not enough information. If the evidence is insufficient, it goes back to planning, up to three times. With GPT-4o it reported 70.5% accuracy on AVeriTeC, 59.2% on MOCHEG, 83.9% on the true/false split of VERITE and 69.7% on ClaimReview2024+, at about 13 US cents and four minutes per claim. Its authors note that it does not weigh source credibility and relies on the search engine’s own trustworthiness checks. It also gives a label without a probability.</w:t>
+        <w:t>DEFAME [1] is the closest system to ours. It runs in six stages (plan, execute, summarise, develop the fact-check, predict, justify), uses web search, image search, reverse image search and a geolocation tool, and returns supported, refuted, misleading or not enough information. If the evidence is insufficient, it goes back to planning, up to three times. With GPT-4o it reported 70.5% accuracy on AVeriTeC, 59.2% on MOCHEG, 83.9% on the true/false split of VERITE and 69.7% on ClaimReview2024+, at about 13 US cents and four minutes per claim. Its authors note that it does not weigh source credibility and relies on the search engine’s own trustworthiness checks. It also gives a label without a probability.</w:t>
       </w:r>
     </w:p>
     <w:p>
@@ -644,7 +644,7 @@
                 <w:i w:val="0"/>
                 <w:sz w:val="22"/>
               </w:rPr>
-              <w:t>[3, 7, 8]</w:t>
+              <w:t>[4, 7, 8]</w:t>
             </w:r>
           </w:p>
         </w:tc>
@@ -862,7 +862,7 @@
                 <w:i w:val="0"/>
                 <w:sz w:val="22"/>
               </w:rPr>
-              <w:t>[6, 11, 12, 13]</w:t>
+              <w:t>[1, 11, 12, 13]</w:t>
             </w:r>
           </w:p>
         </w:tc>
@@ -3747,7 +3747,7 @@
           <w:i w:val="0"/>
           <w:sz w:val="24"/>
         </w:rPr>
-        <w:t xml:space="preserve"> After length filtering, ISOT [3] has 21,379 genuine and 21,915 fake articles. We used the 239 articles whose writing checks had all come from the language model and not from the fallback analysers. A hash of the article ID split them into 119 for estimating the ratios and 120 for testing. All of ISOT’s genuine articles come from Reuters, so we hid the source and stripped agency prefixes such as ‘WASHINGTON (Reuters)’, which would otherwise give the label away. Historical articles have no live coverage, so corroboration plays no part here, and this test covers only the writing half of the model. We had planned to use 300 articles but stopped at 239 when both hosted providers went down during the run, one with HTTP 503 errors and the other out of quota. The baseline is our earlier hand-weighted sum applied to the same check outputs. We report accuracy with 95% Wilson intervals, ROC-AUC, the Brier score and the expected calibration error (ECE) over ten bins. We also compute ECE and precision over accusations alone, meaning the predictions that put the probability of fabrication above 0.5.</w:t>
+        <w:t xml:space="preserve"> After length filtering, ISOT [4] has 21,379 genuine and 21,915 fake articles. We used the 239 articles whose writing checks had all come from the language model and not from the fallback analysers. A hash of the article ID split them into 119 for estimating the ratios and 120 for testing. All of ISOT’s genuine articles come from Reuters, so we hid the source and stripped agency prefixes such as ‘WASHINGTON (Reuters)’, which would otherwise give the label away. Historical articles have no live coverage, so corroboration plays no part here, and this test covers only the writing half of the model. We had planned to use 300 articles but stopped at 239 when both hosted providers went down during the run, one with HTTP 503 errors and the other out of quota. The baseline is our earlier hand-weighted sum applied to the same check outputs. We report accuracy with 95% Wilson intervals, ROC-AUC, the Brier score and the expected calibration error (ECE) over ten bins. We also compute ECE and precision over accusations alone, meaning the predictions that put the probability of fabrication above 0.5.</w:t>
       </w:r>
     </w:p>
     <w:p>
@@ -8238,7 +8238,7 @@
           <w:i w:val="0"/>
           <w:sz w:val="24"/>
         </w:rPr>
-        <w:t>Table 7 puts our numbers next to DEFAME’s and next to the ISOT shortcut reported by Verma [4], who found that a classifier given only the subject field of each article, with the text thrown away, reaches F1 = 1.000. The rows use different data, labels and tasks, so this is not a controlled comparison, and we did not run DEFAME on our cases. The table shows where each number comes from, and that a perfect ISOT score is possible without reading a single article.</w:t>
+        <w:t>Table 7 puts our numbers next to DEFAME’s and next to the ISOT shortcut reported by Verma [5], who found that a classifier given only the subject field of each article, with the text thrown away, reaches F1 = 1.000. The rows use different data, labels and tasks, so this is not a controlled comparison, and we did not run DEFAME on our cases. The table shows where each number comes from, and that a perfect ISOT score is possible without reading a single article.</w:t>
       </w:r>
     </w:p>
     <w:p>
@@ -8431,7 +8431,7 @@
                 <w:i w:val="0"/>
                 <w:sz w:val="22"/>
               </w:rPr>
-              <w:t>DEFAME, GPT-4o [6]</w:t>
+              <w:t>DEFAME, GPT-4o [1]</w:t>
             </w:r>
           </w:p>
         </w:tc>
@@ -8540,7 +8540,7 @@
                 <w:i w:val="0"/>
                 <w:sz w:val="22"/>
               </w:rPr>
-              <w:t>DEFAME, GPT-4o [6]</w:t>
+              <w:t>DEFAME, GPT-4o [1]</w:t>
             </w:r>
           </w:p>
         </w:tc>
@@ -8649,7 +8649,7 @@
                 <w:i w:val="0"/>
                 <w:sz w:val="22"/>
               </w:rPr>
-              <w:t>DEFAME, GPT-4o [6]</w:t>
+              <w:t>DEFAME, GPT-4o [1]</w:t>
             </w:r>
           </w:p>
         </w:tc>
@@ -8758,7 +8758,7 @@
                 <w:i w:val="0"/>
                 <w:sz w:val="22"/>
               </w:rPr>
-              <w:t>Subject field only [4]</w:t>
+              <w:t>Subject field only [5]</w:t>
             </w:r>
           </w:p>
         </w:tc>
@@ -9239,7 +9239,7 @@
           <w:i w:val="0"/>
           <w:sz w:val="24"/>
         </w:rPr>
-        <w:t>ISOT accuracy says little on its own. Verma [4] showed how much of it comes from the corpus, and our held-out set is small: the 95% intervals of the two rules overlap almost completely. What our ISOT test does show is that the one-sided rule costs very little accuracy on ordinary data while making accusations better calibrated. The adversarial set is the test that matters for this design, and there the gap between the rules is clear, four credible against none.</w:t>
+        <w:t>ISOT accuracy says little on its own. Verma [5] showed how much of it comes from the corpus, and our held-out set is small: the 95% intervals of the two rules overlap almost completely. What our ISOT test does show is that the one-sided rule costs very little accuracy on ordinary data while making accusations better calibrated. The adversarial set is the test that matters for this design, and there the gap between the rules is clear, four credible against none.</w:t>
       </w:r>
     </w:p>
     <w:p>
@@ -9438,6 +9438,29 @@
         </w:rPr>
         <w:t>1.</w:t>
         <w:tab/>
+        <w:t>Braun, T., Rothermel, M., Rohrbach, M., Rohrbach, A.: DEFAME: dynamic evidence-based fact-checking with multimodal experts. In: Proceedings of the 42nd International Conference on Machine Learning. PMLR, vol. 267 (2025)</w:t>
+      </w:r>
+    </w:p>
+    <w:p>
+      <w:pPr>
+        <w:keepNext w:val="0"/>
+        <w:widowControl/>
+        <w:tabs>
+          <w:tab w:pos="576" w:val="left"/>
+        </w:tabs>
+        <w:spacing w:before="0" w:after="60" w:line="360" w:lineRule="auto"/>
+        <w:ind w:left="576" w:hanging="576"/>
+        <w:jc w:val="left"/>
+      </w:pPr>
+      <w:r>
+        <w:rPr>
+          <w:rFonts w:ascii="Times New Roman" w:hAnsi="Times New Roman" w:cs="Times New Roman" w:eastAsia="Times New Roman"/>
+          <w:b w:val="0"/>
+          <w:i w:val="0"/>
+          <w:sz w:val="24"/>
+        </w:rPr>
+        <w:t>2.</w:t>
+        <w:tab/>
         <w:t>World Economic Forum: Global Risks Report 2026. World Economic Forum, Geneva (2026). https://www.weforum.org/publications/global-risks-report-2026/</w:t>
       </w:r>
     </w:p>
@@ -9459,7 +9482,7 @@
           <w:i w:val="0"/>
           <w:sz w:val="24"/>
         </w:rPr>
-        <w:t>2.</w:t>
+        <w:t>3.</w:t>
         <w:tab/>
         <w:t xml:space="preserve">Vosoughi, S., Roy, D., Aral, S.: The spread of true and false news online. Science </w:t>
       </w:r>
@@ -9500,7 +9523,7 @@
           <w:i w:val="0"/>
           <w:sz w:val="24"/>
         </w:rPr>
-        <w:t>3.</w:t>
+        <w:t>4.</w:t>
         <w:tab/>
         <w:t>Ahmed, H., Traore, I., Saad, S.: Detection of online fake news using n-gram analysis and machine learning techniques. In: Traore, I., Woungang, I., Awad, A. (eds.) ISDDC 2017. LNCS, vol. 10618, pp. 127–138. Springer, Cham (2017)</w:t>
       </w:r>
@@ -9523,7 +9546,7 @@
           <w:i w:val="0"/>
           <w:sz w:val="24"/>
         </w:rPr>
-        <w:t>4.</w:t>
+        <w:t>5.</w:t>
         <w:tab/>
         <w:t>Verma, Y.: What does 99% accuracy measure? A reproducible audit of shortcut learning in a widely used fake news corpus. arXiv preprint arXiv:2609.25006 (2026)</w:t>
       </w:r>
@@ -9546,32 +9569,9 @@
           <w:i w:val="0"/>
           <w:sz w:val="24"/>
         </w:rPr>
-        <w:t>5.</w:t>
+        <w:t>6.</w:t>
         <w:tab/>
         <w:t>Chen, C., Shu, K.: Can LLM-generated misinformation be detected? In: Proceedings of the Twelfth International Conference on Learning Representations (ICLR) (2024)</w:t>
-      </w:r>
-    </w:p>
-    <w:p>
-      <w:pPr>
-        <w:keepNext w:val="0"/>
-        <w:widowControl/>
-        <w:tabs>
-          <w:tab w:pos="576" w:val="left"/>
-        </w:tabs>
-        <w:spacing w:before="0" w:after="60" w:line="360" w:lineRule="auto"/>
-        <w:ind w:left="576" w:hanging="576"/>
-        <w:jc w:val="left"/>
-      </w:pPr>
-      <w:r>
-        <w:rPr>
-          <w:rFonts w:ascii="Times New Roman" w:hAnsi="Times New Roman" w:cs="Times New Roman" w:eastAsia="Times New Roman"/>
-          <w:b w:val="0"/>
-          <w:i w:val="0"/>
-          <w:sz w:val="24"/>
-        </w:rPr>
-        <w:t>6.</w:t>
-        <w:tab/>
-        <w:t>Braun, T., Rothermel, M., Rohrbach, M., Rohrbach, A.: DEFAME: dynamic evidence-based fact-checking with multimodal experts. In: Proceedings of the 42nd International Conference on Machine Learning. PMLR, vol. 267 (2025)</w:t>
       </w:r>
     </w:p>
     <w:p>
@@ -10008,20 +10008,8 @@
   <w:p>
     <w:pPr>
       <w:pStyle w:val="Header"/>
-      <w:tabs>
-        <w:tab w:pos="9029" w:val="right"/>
-      </w:tabs>
+      <w:jc w:val="right"/>
     </w:pPr>
-    <w:r>
-      <w:rPr>
-        <w:rFonts w:ascii="Times New Roman" w:hAnsi="Times New Roman" w:cs="Times New Roman" w:eastAsia="Times New Roman"/>
-        <w:b w:val="0"/>
-        <w:i w:val="0"/>
-        <w:sz w:val="20"/>
-      </w:rPr>
-      <w:t>Evidence-Based Fake News Detection with Calibrated Scoring</w:t>
-      <w:tab/>
-    </w:r>
     <w:r>
       <w:rPr>
         <w:rFonts w:ascii="Times New Roman" w:hAnsi="Times New Roman" w:cs="Times New Roman" w:eastAsia="Times New Roman"/>

</xml_diff>

<commit_message>
Paper: plain white figures and the report's reference list
Grey panel fills and gridlines removed from the figures. References now
match the report: 14 works, all from 2020 on, each with a link, with
DEFAME first.
</commit_message>
<xml_diff>
--- a/docs/paper/NICOM_Paper_CO5.docx
+++ b/docs/paper/NICOM_Paper_CO5.docx
@@ -206,7 +206,7 @@
           <w:i w:val="0"/>
           <w:sz w:val="24"/>
         </w:rPr>
-        <w:t>, the World Economic Forum ranked misinformation and disinformation as the second most severe global risk over the next two years, just behind geoeconomic confrontation [2]. False stories also travel further and faster than true ones on social media [3]. Most people meet them as a forwarded message, a screenshot or a link, with no easy way to check where they came from.</w:t>
+        <w:t>, the World Economic Forum ranked misinformation and disinformation as the second most severe global risk over the next two years, just behind geoeconomic confrontation [2]. Language models now make convincing fakes cheap to produce [3]. Most people meet them as a forwarded message, a screenshot or a link, with no easy way to check where they came from.</w:t>
       </w:r>
     </w:p>
     <w:p>
@@ -224,7 +224,7 @@
           <w:i w:val="0"/>
           <w:sz w:val="24"/>
         </w:rPr>
-        <w:t>Automated detectors are supposed to help with that. Most of them treat the problem as text classification: a model reads the article and labels it fake or real from its wording. Scores on public datasets are high. On ISOT [4], accuracies above 99% are common, but an audit by Verma [5] traced much of that to the way the corpus was put together. There is a simpler problem too. A style-based detector rewards features that the writer controls. Anyone fabricating a story can keep the headline calm, quote named officials and avoid loaded words. Chen and Shu [6] found that misinformation rewritten by a language model is harder for both people and detectors to catch than the human-written version with the same meaning.</w:t>
+        <w:t>Automated detectors are supposed to help with that. Most of them treat the problem as text classification: a model reads the article and labels it fake or real from its wording. Scores on public datasets are high. On the ISOT corpus, accuracies above 99% are common, but an audit by Verma [4] traced much of that to the way the corpus was put together. There is a simpler problem too. A style-based detector rewards features that the writer controls. Anyone fabricating a story can keep the headline calm, quote named officials and avoid loaded words. Chen and Shu [3] found that misinformation rewritten by a language model is harder for both people and detectors to catch than the human-written version with the same meaning.</w:t>
       </w:r>
     </w:p>
     <w:p>
@@ -335,7 +335,7 @@
           <w:i w:val="0"/>
           <w:sz w:val="24"/>
         </w:rPr>
-        <w:t>Content-based detectors classify the article text. Ahmed et al. [4] built ISOT from Reuters stories and from articles flagged by fact-checkers and trained n-gram classifiers on it. Shu et al. [7] added explanations with dEFEND, which attends to article sentences and user comments together and shows the comments that point most strongly to deception. It needs those comments, though, and an article that has just been forwarded to someone has none. Da San Martino et al. [8] defined a span-level taxonomy of persuasion techniques for SemEval-2020, which we use for one of our writing checks.</w:t>
+        <w:t>Content-based detectors classify the article text. Amri et al. [5] built ExFake, which combines the article with its social context and outside evidence to explain each decision. Its strongest signals, such as who shares a post, only arrive after a story has spread, and an article that has just been forwarded to someone has none. Da San Martino et al. [6] defined a span-level taxonomy of persuasion techniques for SemEval-2020, which we use for one of our writing checks.</w:t>
       </w:r>
     </w:p>
     <w:p>
@@ -353,7 +353,7 @@
           <w:i w:val="0"/>
           <w:sz w:val="24"/>
         </w:rPr>
-        <w:t>Large language models have been tried both as detectors and as helpers. Hu et al. [9] found that GPT-3.5 used directly did worse than a fine-tuned small model, but its written rationales helped the small model when given as extra input. Wang et al. [10] had a language model argue both sides of a claim from collections of raw reports and then pick the better-supported explanation. Both still judge the content or rely on many reports per claim.</w:t>
+        <w:t>Large language models have been tried both as detectors and as helpers. Hu et al. [7] found that GPT-3.5 used directly did worse than a fine-tuned small model, but its written rationales helped the small model when given as extra input. Wang et al. [8] had a language model argue both sides of a claim from collections of raw reports and then pick the better-supported explanation. Both still judge the content or rely on many reports per claim.</w:t>
       </w:r>
     </w:p>
     <w:p>
@@ -371,7 +371,7 @@
           <w:i w:val="0"/>
           <w:sz w:val="24"/>
         </w:rPr>
-        <w:t>Evidence-based fact-checking tests claims against outside sources. FEVER [11] set up claim verification against Wikipedia sentences. Guo et al. [12] describe the whole pipeline, from claim detection through evidence retrieval and verdict prediction to justification, and point out that most systems assumed the evidence was already at hand. AVeriTeC [13] pairs real-world claims with evidence from the open web.</w:t>
+        <w:t>Evidence-based fact-checking tests claims against outside sources. Guo et al. [9] describe the whole pipeline, from claim detection through evidence retrieval and verdict prediction to justification, and point out that most systems assumed the evidence was already at hand. AVeriTeC [10] pairs real-world claims with evidence from the open web.</w:t>
       </w:r>
     </w:p>
     <w:p>
@@ -407,7 +407,7 @@
           <w:i w:val="0"/>
           <w:sz w:val="24"/>
         </w:rPr>
-        <w:t>Source ratings are another way in. Pennycook and Rand [14] showed that ratings of news sources collected from lay people agree well with fact-checkers’ ratings, and Lin et al. [15] combined six professional rating sets into one score for 11,520 news domains. A rating only helps if the outlet is identified correctly. A system that trusts the name printed on a page will give a copycat site the original’s record.</w:t>
+        <w:t>Source ratings are another way in. Lin et al. [11] found that six professional rating sets for news sites agree closely, and they six professional rating sets into one score for 11,520 news domains. A rating only helps if the outlet is identified correctly. A system that trusts the name printed on a page will give a copycat site the original’s record.</w:t>
       </w:r>
     </w:p>
     <w:p>
@@ -425,7 +425,7 @@
           <w:i w:val="0"/>
           <w:sz w:val="24"/>
         </w:rPr>
-        <w:t>Calibration and abstention come from machine learning more broadly. Guo et al. [16] showed that modern neural networks tend to be overconfident, and isotonic regression [17] is a common fix. We add evidence as log-odds in decibans, following Good [18]. Chow [19] described the optimal reject option for a classifier, and Geifman and El-Yaniv [20] applied selective classification to deep networks. Table 1 groups the cited work.</w:t>
+        <w:t>Calibration and abstention come from machine learning more broadly. Minderer et al. [12] found that calibration varies a lot from one model family to another, so a stated confidence has to be measured before it can be read as a probability. Silva Filho et al. [13] surveyed how to measure and repair calibration, including isotonic regression. Hendrickx et al. [14] surveyed models that may decline to answer and how such refusals should be judged. Table 1 groups the cited work.</w:t>
       </w:r>
     </w:p>
     <w:p>
@@ -644,7 +644,7 @@
                 <w:i w:val="0"/>
                 <w:sz w:val="22"/>
               </w:rPr>
-              <w:t>[4, 7, 8]</w:t>
+              <w:t>[4, 5, 6]</w:t>
             </w:r>
           </w:p>
         </w:tc>
@@ -670,7 +670,7 @@
                 <w:i w:val="0"/>
                 <w:sz w:val="22"/>
               </w:rPr>
-              <w:t>Article text, user comments; a label</w:t>
+              <w:t>Article text, social context; a label</w:t>
             </w:r>
           </w:p>
         </w:tc>
@@ -753,7 +753,7 @@
                 <w:i w:val="0"/>
                 <w:sz w:val="22"/>
               </w:rPr>
-              <w:t>[9, 10]</w:t>
+              <w:t>[7, 8]</w:t>
             </w:r>
           </w:p>
         </w:tc>
@@ -862,7 +862,7 @@
                 <w:i w:val="0"/>
                 <w:sz w:val="22"/>
               </w:rPr>
-              <w:t>[1, 11, 12, 13]</w:t>
+              <w:t>[1, 9, 10]</w:t>
             </w:r>
           </w:p>
         </w:tc>
@@ -971,7 +971,7 @@
                 <w:i w:val="0"/>
                 <w:sz w:val="22"/>
               </w:rPr>
-              <w:t>[14, 15]</w:t>
+              <w:t>[11]</w:t>
             </w:r>
           </w:p>
         </w:tc>
@@ -1082,7 +1082,7 @@
                 <w:i w:val="0"/>
                 <w:sz w:val="22"/>
               </w:rPr>
-              <w:t>[16, 17, 18, 19, 20]</w:t>
+              <w:t>[12, 13, 14]</w:t>
             </w:r>
           </w:p>
         </w:tc>
@@ -1538,7 +1538,7 @@
           <w:i w:val="0"/>
           <w:sz w:val="24"/>
         </w:rPr>
-        <w:t xml:space="preserve"> The publisher is decided from the web address, not from the name the page gives itself. An outlet’s record applies only on a domain it publishes from or on a platform channel listed as its own. Ratings come first from our list of 90 outlets, which includes Indian publishers missing from the published sets, and otherwise from the ratings of Lin et al. [15] for 11,520 domains. On the 81 outlets in both, the two agree well (Pearson </w:t>
+        <w:t xml:space="preserve"> The publisher is decided from the web address, not from the name the page gives itself. An outlet’s record applies only on a domain it publishes from or on a platform channel listed as its own. Ratings come first from our list of 90 outlets, which includes Indian publishers missing from the published sets, and otherwise from the ratings of Lin et al. [11] for 11,520 domains. On the 81 outlets in both, the two agree well (Pearson </w:t>
       </w:r>
       <w:r>
         <w:rPr>
@@ -1613,7 +1613,7 @@
           <w:i w:val="0"/>
           <w:sz w:val="24"/>
         </w:rPr>
-        <w:t>Four checks look at how the story is written: clickbait in the headline, slanted or one-sided language, persuasion techniques from the SemEval-2020 taxonomy [8], and transparency, a five-point checklist covering named sources, attributed quotes, links to primary evidence, concrete detail and measured claims. Each check has to quote the words it is reacting to, so its output can be compared with the text. The reader sees all four. How much they may affect the result is set by the scoring rule in Sect. 3.5.</w:t>
+        <w:t>Four checks look at how the story is written: clickbait in the headline, slanted or one-sided language, persuasion techniques from the SemEval-2020 taxonomy [6], and transparency, a five-point checklist covering named sources, attributed quotes, links to primary evidence, concrete detail and measured claims. Each check has to quote the words it is reacting to, so its output can be compared with the text. The reader sees all four. How much they may affect the result is set by the scoring rule in Sect. 3.5.</w:t>
       </w:r>
     </w:p>
     <w:p>
@@ -1670,7 +1670,7 @@
           <w:i w:val="0"/>
           <w:sz w:val="24"/>
         </w:rPr>
-        <w:t xml:space="preserve"> is turned into a likelihood ratio and expressed in decibans [18]:</w:t>
+        <w:t xml:space="preserve"> is turned into a likelihood ratio and expressed in decibans:</w:t>
       </w:r>
     </w:p>
     <w:tbl>
@@ -1850,7 +1850,7 @@
           <w:i w:val="0"/>
           <w:sz w:val="24"/>
         </w:rPr>
-        <w:t>The ratios are estimated from labelled articles by putting each observation into bands and counting, with a Jeffreys prior [21]. Each estimate is shrunk to the conservative end of its 95% interval, so a band with only a few articles behind it contributes nothing. The log-odds of fabrication are then a sum:</w:t>
+        <w:t>The ratios are estimated from labelled articles by putting each observation into bands and counting, with a Jeffreys prior. Each estimate is shrunk to the conservative end of its 95% interval, so a band with only a few articles behind it contributes nothing. The log-odds of fabrication are then a sum:</w:t>
       </w:r>
     </w:p>
     <w:tbl>
@@ -2590,7 +2590,7 @@
           <w:i w:val="0"/>
           <w:sz w:val="24"/>
         </w:rPr>
-        <w:t xml:space="preserve"> = 0.379 and capped at 8 decibans. Finally, the summed log-odds are calibrated with isotonic regression [17] on held-out data. When we first fitted the map, it quietly put back the weight Eq. (3) had removed, because it was fitted on ISOT, where clean style does go with genuine articles. The clamp is now applied again after calibration, and a regression test checks it.</w:t>
+        <w:t xml:space="preserve"> = 0.379 and capped at 8 decibans. Finally, the summed log-odds are calibrated with isotonic regression [13] on held-out data. When we first fitted the map, it quietly put back the weight Eq. (3) had removed, because it was fitted on ISOT, where clean style does go with genuine articles. The clamp is now applied again after calibration, and a regression test checks it.</w:t>
       </w:r>
     </w:p>
     <w:p>
@@ -3747,7 +3747,7 @@
           <w:i w:val="0"/>
           <w:sz w:val="24"/>
         </w:rPr>
-        <w:t xml:space="preserve"> After length filtering, ISOT [4] has 21,379 genuine and 21,915 fake articles. We used the 239 articles whose writing checks had all come from the language model and not from the fallback analysers. A hash of the article ID split them into 119 for estimating the ratios and 120 for testing. All of ISOT’s genuine articles come from Reuters, so we hid the source and stripped agency prefixes such as ‘WASHINGTON (Reuters)’, which would otherwise give the label away. Historical articles have no live coverage, so corroboration plays no part here, and this test covers only the writing half of the model. We had planned to use 300 articles but stopped at 239 when both hosted providers went down during the run, one with HTTP 503 errors and the other out of quota. The baseline is our earlier hand-weighted sum applied to the same check outputs. We report accuracy with 95% Wilson intervals, ROC-AUC, the Brier score and the expected calibration error (ECE) over ten bins. We also compute ECE and precision over accusations alone, meaning the predictions that put the probability of fabrication above 0.5.</w:t>
+        <w:t xml:space="preserve"> After length filtering, ISOT has 21,379 genuine and 21,915 fake articles. We used the 239 articles whose writing checks had all come from the language model and not from the fallback analysers. A hash of the article ID split them into 119 for estimating the ratios and 120 for testing. All of ISOT’s genuine articles come from Reuters, so we hid the source and stripped agency prefixes such as ‘WASHINGTON (Reuters)’, which would otherwise give the label away. Historical articles have no live coverage, so corroboration plays no part here, and this test covers only the writing half of the model. We had planned to use 300 articles but stopped at 239 when both hosted providers went down during the run, one with HTTP 503 errors and the other out of quota. The baseline is our earlier hand-weighted sum applied to the same check outputs. We report accuracy with 95% Wilson intervals, ROC-AUC, the Brier score and the expected calibration error (ECE) over ten bins. We also compute ECE and precision over accusations alone, meaning the predictions that put the probability of fabrication above 0.5.</w:t>
       </w:r>
     </w:p>
     <w:p>
@@ -8238,7 +8238,7 @@
           <w:i w:val="0"/>
           <w:sz w:val="24"/>
         </w:rPr>
-        <w:t>Table 7 puts our numbers next to DEFAME’s and next to the ISOT shortcut reported by Verma [5], who found that a classifier given only the subject field of each article, with the text thrown away, reaches F1 = 1.000. The rows use different data, labels and tasks, so this is not a controlled comparison, and we did not run DEFAME on our cases. The table shows where each number comes from, and that a perfect ISOT score is possible without reading a single article.</w:t>
+        <w:t>Table 7 puts our numbers next to DEFAME’s and next to the ISOT shortcut reported by Verma [4], who found that a classifier given only the subject field of each article, with the text thrown away, reaches F1 = 1.000. The rows use different data, labels and tasks, so this is not a controlled comparison, and we did not run DEFAME on our cases. The table shows where each number comes from, and that a perfect ISOT score is possible without reading a single article.</w:t>
       </w:r>
     </w:p>
     <w:p>
@@ -8758,7 +8758,7 @@
                 <w:i w:val="0"/>
                 <w:sz w:val="22"/>
               </w:rPr>
-              <w:t>Subject field only [5]</w:t>
+              <w:t>Subject field only [4]</w:t>
             </w:r>
           </w:p>
         </w:tc>
@@ -9239,7 +9239,7 @@
           <w:i w:val="0"/>
           <w:sz w:val="24"/>
         </w:rPr>
-        <w:t>ISOT accuracy says little on its own. Verma [5] showed how much of it comes from the corpus, and our held-out set is small: the 95% intervals of the two rules overlap almost completely. What our ISOT test does show is that the one-sided rule costs very little accuracy on ordinary data while making accusations better calibrated. The adversarial set is the test that matters for this design, and there the gap between the rules is clear, four credible against none.</w:t>
+        <w:t>ISOT accuracy says little on its own. Verma [4] showed how much of it comes from the corpus, and our held-out set is small: the 95% intervals of the two rules overlap almost completely. What our ISOT test does show is that the one-sided rule costs very little accuracy on ordinary data while making accusations better calibrated. The adversarial set is the test that matters for this design, and there the gap between the rules is clear, four credible against none.</w:t>
       </w:r>
     </w:p>
     <w:p>
@@ -9438,7 +9438,7 @@
         </w:rPr>
         <w:t>1.</w:t>
         <w:tab/>
-        <w:t>Braun, T., Rothermel, M., Rohrbach, M., Rohrbach, A.: DEFAME: dynamic evidence-based fact-checking with multimodal experts. In: Proceedings of the 42nd International Conference on Machine Learning. PMLR, vol. 267 (2025)</w:t>
+        <w:t>Braun, T., Rothermel, M., Rohrbach, M., Rohrbach, A.: DEFAME: dynamic evidence-based fact-checking with multimodal experts. In: Proceedings of the 42nd International Conference on Machine Learning. PMLR, vol. 267 (2025). https://arxiv.org/abs/2412.10510</w:t>
       </w:r>
     </w:p>
     <w:p>
@@ -9484,25 +9484,7 @@
         </w:rPr>
         <w:t>3.</w:t>
         <w:tab/>
-        <w:t xml:space="preserve">Vosoughi, S., Roy, D., Aral, S.: The spread of true and false news online. Science </w:t>
-      </w:r>
-      <w:r>
-        <w:rPr>
-          <w:rFonts w:ascii="Times New Roman" w:hAnsi="Times New Roman" w:cs="Times New Roman" w:eastAsia="Times New Roman"/>
-          <w:b/>
-          <w:i w:val="0"/>
-          <w:sz w:val="24"/>
-        </w:rPr>
-        <w:t>359</w:t>
-      </w:r>
-      <w:r>
-        <w:rPr>
-          <w:rFonts w:ascii="Times New Roman" w:hAnsi="Times New Roman" w:cs="Times New Roman" w:eastAsia="Times New Roman"/>
-          <w:b w:val="0"/>
-          <w:i w:val="0"/>
-          <w:sz w:val="24"/>
-        </w:rPr>
-        <w:t>(6380), 1146–1151 (2018). https://doi.org/10.1126/science.aap9559</w:t>
+        <w:t>Chen, C., Shu, K.: Can LLM-generated misinformation be detected? In: Proceedings of the Twelfth International Conference on Learning Representations (ICLR) (2024). https://arxiv.org/abs/2309.13788</w:t>
       </w:r>
     </w:p>
     <w:p>
@@ -9525,7 +9507,7 @@
         </w:rPr>
         <w:t>4.</w:t>
         <w:tab/>
-        <w:t>Ahmed, H., Traore, I., Saad, S.: Detection of online fake news using n-gram analysis and machine learning techniques. In: Traore, I., Woungang, I., Awad, A. (eds.) ISDDC 2017. LNCS, vol. 10618, pp. 127–138. Springer, Cham (2017)</w:t>
+        <w:t>Verma, Y.: What does 99% accuracy measure? A reproducible audit of shortcut learning in a widely used fake news corpus. arXiv preprint arXiv:2609.25006 (2026). https://arxiv.org/abs/2609.25006</w:t>
       </w:r>
     </w:p>
     <w:p>
@@ -9548,7 +9530,7 @@
         </w:rPr>
         <w:t>5.</w:t>
         <w:tab/>
-        <w:t>Verma, Y.: What does 99% accuracy measure? A reproducible audit of shortcut learning in a widely used fake news corpus. arXiv preprint arXiv:2609.25006 (2026)</w:t>
+        <w:t>Amri, S., Mputu Boleilanga, H.-C., Aïmeur, E.: ExFake: towards an explainable fake news detection based on content and social context information. arXiv preprint arXiv:2311.10784 (2023). https://arxiv.org/abs/2311.10784</w:t>
       </w:r>
     </w:p>
     <w:p>
@@ -9571,7 +9553,7 @@
         </w:rPr>
         <w:t>6.</w:t>
         <w:tab/>
-        <w:t>Chen, C., Shu, K.: Can LLM-generated misinformation be detected? In: Proceedings of the Twelfth International Conference on Learning Representations (ICLR) (2024)</w:t>
+        <w:t>Da San Martino, G., Barrón-Cedeño, A., Wachsmuth, H., Petrov, R., Nakov, P.: SemEval-2020 Task 11: detection of propaganda techniques in news articles. In: Proceedings of the Fourteenth Workshop on Semantic Evaluation, pp. 1377–1414 (2020). https://doi.org/10.18653/v1/2020.semeval-1.186</w:t>
       </w:r>
     </w:p>
     <w:p>
@@ -9594,7 +9576,7 @@
         </w:rPr>
         <w:t>7.</w:t>
         <w:tab/>
-        <w:t>Shu, K., Cui, L., Wang, S., Lee, D., Liu, H.: dEFEND: explainable fake news detection. In: Proceedings of the 25th ACM SIGKDD International Conference on Knowledge Discovery and Data Mining, pp. 395–405. ACM (2019). https://doi.org/10.1145/3292500.3330935</w:t>
+        <w:t>Hu, B., Sheng, Q., Cao, J., Shi, Y., Li, Y., Wang, D., Qi, P.: Bad actor, good advisor: exploring the role of large language models in fake news detection. In: Proceedings of the AAAI Conference on Artificial Intelligence, vol. 38(20), pp. 22105–22113 (2024). https://doi.org/10.1609/aaai.v38i20.30214</w:t>
       </w:r>
     </w:p>
     <w:p>
@@ -9617,7 +9599,7 @@
         </w:rPr>
         <w:t>8.</w:t>
         <w:tab/>
-        <w:t>Da San Martino, G., Barrón-Cedeño, A., Wachsmuth, H., Petrov, R., Nakov, P.: SemEval-2020 Task 11: detection of propaganda techniques in news articles. In: Proceedings of the Fourteenth Workshop on Semantic Evaluation, pp. 1377–1414. ICCL (2020). https://doi.org/10.18653/v1/2020.semeval-1.186</w:t>
+        <w:t>Wang, B., Ma, J., Lin, H., Yang, Z., Yang, R., Tian, Y., Chang, Y.: Explainable fake news detection with large language model via defense among competing wisdom. In: Proceedings of the ACM Web Conference 2024, pp. 2452–2463 (2024). https://doi.org/10.1145/3589334.3645471</w:t>
       </w:r>
     </w:p>
     <w:p>
@@ -9639,75 +9621,6 @@
           <w:sz w:val="24"/>
         </w:rPr>
         <w:t>9.</w:t>
-        <w:tab/>
-        <w:t>Hu, B., Sheng, Q., Cao, J., Shi, Y., Li, Y., Wang, D., Qi, P.: Bad actor, good advisor: exploring the role of large language models in fake news detection. In: Proceedings of the AAAI Conference on Artificial Intelligence, vol. 38(20), pp. 22105–22113 (2024). https://doi.org/10.1609/aaai.v38i20.30214</w:t>
-      </w:r>
-    </w:p>
-    <w:p>
-      <w:pPr>
-        <w:keepNext w:val="0"/>
-        <w:widowControl/>
-        <w:tabs>
-          <w:tab w:pos="576" w:val="left"/>
-        </w:tabs>
-        <w:spacing w:before="0" w:after="60" w:line="360" w:lineRule="auto"/>
-        <w:ind w:left="576" w:hanging="576"/>
-        <w:jc w:val="left"/>
-      </w:pPr>
-      <w:r>
-        <w:rPr>
-          <w:rFonts w:ascii="Times New Roman" w:hAnsi="Times New Roman" w:cs="Times New Roman" w:eastAsia="Times New Roman"/>
-          <w:b w:val="0"/>
-          <w:i w:val="0"/>
-          <w:sz w:val="24"/>
-        </w:rPr>
-        <w:t>10.</w:t>
-        <w:tab/>
-        <w:t>Wang, B., Ma, J., Lin, H., Yang, Z., Yang, R., Tian, Y., Chang, Y.: Explainable fake news detection with large language model via defense among competing wisdom. In: Proceedings of the ACM Web Conference 2024, pp. 2452–2463. ACM (2024)</w:t>
-      </w:r>
-    </w:p>
-    <w:p>
-      <w:pPr>
-        <w:keepNext w:val="0"/>
-        <w:widowControl/>
-        <w:tabs>
-          <w:tab w:pos="576" w:val="left"/>
-        </w:tabs>
-        <w:spacing w:before="0" w:after="60" w:line="360" w:lineRule="auto"/>
-        <w:ind w:left="576" w:hanging="576"/>
-        <w:jc w:val="left"/>
-      </w:pPr>
-      <w:r>
-        <w:rPr>
-          <w:rFonts w:ascii="Times New Roman" w:hAnsi="Times New Roman" w:cs="Times New Roman" w:eastAsia="Times New Roman"/>
-          <w:b w:val="0"/>
-          <w:i w:val="0"/>
-          <w:sz w:val="24"/>
-        </w:rPr>
-        <w:t>11.</w:t>
-        <w:tab/>
-        <w:t>Thorne, J., Vlachos, A., Christodoulopoulos, C., Mittal, A.: FEVER: a large-scale dataset for fact extraction and VERification. In: Proceedings of NAACL-HLT 2018, vol. 1, pp. 809–819. ACL (2018). https://doi.org/10.18653/v1/N18-1074</w:t>
-      </w:r>
-    </w:p>
-    <w:p>
-      <w:pPr>
-        <w:keepNext w:val="0"/>
-        <w:widowControl/>
-        <w:tabs>
-          <w:tab w:pos="576" w:val="left"/>
-        </w:tabs>
-        <w:spacing w:before="0" w:after="60" w:line="360" w:lineRule="auto"/>
-        <w:ind w:left="576" w:hanging="576"/>
-        <w:jc w:val="left"/>
-      </w:pPr>
-      <w:r>
-        <w:rPr>
-          <w:rFonts w:ascii="Times New Roman" w:hAnsi="Times New Roman" w:cs="Times New Roman" w:eastAsia="Times New Roman"/>
-          <w:b w:val="0"/>
-          <w:i w:val="0"/>
-          <w:sz w:val="24"/>
-        </w:rPr>
-        <w:t>12.</w:t>
         <w:tab/>
         <w:t xml:space="preserve">Guo, Z., Schlichtkrull, M., Vlachos, A.: A survey on automated fact-checking. Transactions of the Association for Computational Linguistics </w:t>
       </w:r>
@@ -9748,9 +9661,9 @@
           <w:i w:val="0"/>
           <w:sz w:val="24"/>
         </w:rPr>
-        <w:t>13.</w:t>
+        <w:t>10.</w:t>
         <w:tab/>
-        <w:t>Schlichtkrull, M., Guo, Z., Vlachos, A.: AVeriTeC: a dataset for real-world claim verification with evidence from the web. In: Advances in Neural Information Processing Systems, vol. 36, Datasets and Benchmarks Track (2023)</w:t>
+        <w:t>Schlichtkrull, M., Guo, Z., Vlachos, A.: AVeriTeC: a dataset for real-world claim verification with evidence from the web. In: Advances in Neural Information Processing Systems, vol. 36, Datasets and Benchmarks Track (2023). https://arxiv.org/abs/2305.13117</w:t>
       </w:r>
     </w:p>
     <w:p>
@@ -9771,48 +9684,7 @@
           <w:i w:val="0"/>
           <w:sz w:val="24"/>
         </w:rPr>
-        <w:t>14.</w:t>
-        <w:tab/>
-        <w:t xml:space="preserve">Pennycook, G., Rand, D.G.: Fighting misinformation on social media using crowdsourced judgments of news source quality. Proceedings of the National Academy of Sciences </w:t>
-      </w:r>
-      <w:r>
-        <w:rPr>
-          <w:rFonts w:ascii="Times New Roman" w:hAnsi="Times New Roman" w:cs="Times New Roman" w:eastAsia="Times New Roman"/>
-          <w:b/>
-          <w:i w:val="0"/>
-          <w:sz w:val="24"/>
-        </w:rPr>
-        <w:t>116</w:t>
-      </w:r>
-      <w:r>
-        <w:rPr>
-          <w:rFonts w:ascii="Times New Roman" w:hAnsi="Times New Roman" w:cs="Times New Roman" w:eastAsia="Times New Roman"/>
-          <w:b w:val="0"/>
-          <w:i w:val="0"/>
-          <w:sz w:val="24"/>
-        </w:rPr>
-        <w:t>(7), 2521–2526 (2019). https://doi.org/10.1073/pnas.1806781116</w:t>
-      </w:r>
-    </w:p>
-    <w:p>
-      <w:pPr>
-        <w:keepNext w:val="0"/>
-        <w:widowControl/>
-        <w:tabs>
-          <w:tab w:pos="576" w:val="left"/>
-        </w:tabs>
-        <w:spacing w:before="0" w:after="60" w:line="360" w:lineRule="auto"/>
-        <w:ind w:left="576" w:hanging="576"/>
-        <w:jc w:val="left"/>
-      </w:pPr>
-      <w:r>
-        <w:rPr>
-          <w:rFonts w:ascii="Times New Roman" w:hAnsi="Times New Roman" w:cs="Times New Roman" w:eastAsia="Times New Roman"/>
-          <w:b w:val="0"/>
-          <w:i w:val="0"/>
-          <w:sz w:val="24"/>
-        </w:rPr>
-        <w:t>15.</w:t>
+        <w:t>11.</w:t>
         <w:tab/>
         <w:t xml:space="preserve">Lin, H., Lasser, J., Lewandowsky, S., Cole, R., Gully, A., Rand, D.G., Pennycook, G.: High level of correspondence across different news domain quality rating sets. PNAS Nexus </w:t>
       </w:r>
@@ -9853,9 +9725,9 @@
           <w:i w:val="0"/>
           <w:sz w:val="24"/>
         </w:rPr>
-        <w:t>16.</w:t>
+        <w:t>12.</w:t>
         <w:tab/>
-        <w:t>Guo, C., Pleiss, G., Sun, Y., Weinberger, K.Q.: On calibration of modern neural networks. In: Proceedings of the 34th International Conference on Machine Learning. PMLR, vol. 70, pp. 1321–1330 (2017)</w:t>
+        <w:t>Minderer, M., Djolonga, J., Romijnders, R., Hubis, F., Zhai, X., Houlsby, N., Tran, D., Lucic, M.: Revisiting the calibration of modern neural networks. In: Advances in Neural Information Processing Systems, vol. 34 (2021). https://arxiv.org/abs/2106.07998</w:t>
       </w:r>
     </w:p>
     <w:p>
@@ -9876,9 +9748,27 @@
           <w:i w:val="0"/>
           <w:sz w:val="24"/>
         </w:rPr>
-        <w:t>17.</w:t>
+        <w:t>13.</w:t>
         <w:tab/>
-        <w:t>Zadrozny, B., Elkan, C.: Transforming classifier scores into accurate multiclass probability estimates. In: Proceedings of the Eighth ACM SIGKDD International Conference on Knowledge Discovery and Data Mining, pp. 694–699. ACM (2002). https://doi.org/10.1145/775047.775151</w:t>
+        <w:t xml:space="preserve">Silva Filho, T., Song, H., Perello-Nieto, M., Santos-Rodriguez, R., Kull, M., Flach, P.: Classifier calibration: a survey on how to assess and improve predicted class probabilities. Machine Learning </w:t>
+      </w:r>
+      <w:r>
+        <w:rPr>
+          <w:rFonts w:ascii="Times New Roman" w:hAnsi="Times New Roman" w:cs="Times New Roman" w:eastAsia="Times New Roman"/>
+          <w:b/>
+          <w:i w:val="0"/>
+          <w:sz w:val="24"/>
+        </w:rPr>
+        <w:t>112</w:t>
+      </w:r>
+      <w:r>
+        <w:rPr>
+          <w:rFonts w:ascii="Times New Roman" w:hAnsi="Times New Roman" w:cs="Times New Roman" w:eastAsia="Times New Roman"/>
+          <w:b w:val="0"/>
+          <w:i w:val="0"/>
+          <w:sz w:val="24"/>
+        </w:rPr>
+        <w:t>(9), 3211–3260 (2023). https://doi.org/10.1007/s10994-023-06336-7</w:t>
       </w:r>
     </w:p>
     <w:p>
@@ -9899,32 +9789,9 @@
           <w:i w:val="0"/>
           <w:sz w:val="24"/>
         </w:rPr>
-        <w:t>18.</w:t>
+        <w:t>14.</w:t>
         <w:tab/>
-        <w:t>Good, I.J.: Probability and the Weighing of Evidence. Charles Griffin, London (1950)</w:t>
-      </w:r>
-    </w:p>
-    <w:p>
-      <w:pPr>
-        <w:keepNext w:val="0"/>
-        <w:widowControl/>
-        <w:tabs>
-          <w:tab w:pos="576" w:val="left"/>
-        </w:tabs>
-        <w:spacing w:before="0" w:after="60" w:line="360" w:lineRule="auto"/>
-        <w:ind w:left="576" w:hanging="576"/>
-        <w:jc w:val="left"/>
-      </w:pPr>
-      <w:r>
-        <w:rPr>
-          <w:rFonts w:ascii="Times New Roman" w:hAnsi="Times New Roman" w:cs="Times New Roman" w:eastAsia="Times New Roman"/>
-          <w:b w:val="0"/>
-          <w:i w:val="0"/>
-          <w:sz w:val="24"/>
-        </w:rPr>
-        <w:t>19.</w:t>
-        <w:tab/>
-        <w:t xml:space="preserve">Chow, C.K.: On optimum recognition error and reject tradeoff. IEEE Transactions on Information Theory </w:t>
+        <w:t xml:space="preserve">Hendrickx, K., Perini, L., Van der Plas, D., Meert, W., Davis, J.: Machine learning with a reject option: a survey. Machine Learning </w:t>
       </w:r>
       <w:r>
         <w:rPr>
@@ -9933,7 +9800,7 @@
           <w:i w:val="0"/>
           <w:sz w:val="24"/>
         </w:rPr>
-        <w:t>16</w:t>
+        <w:t>113</w:t>
       </w:r>
       <w:r>
         <w:rPr>
@@ -9942,53 +9809,7 @@
           <w:i w:val="0"/>
           <w:sz w:val="24"/>
         </w:rPr>
-        <w:t>(1), 41–46 (1970). https://doi.org/10.1109/TIT.1970.1054406</w:t>
-      </w:r>
-    </w:p>
-    <w:p>
-      <w:pPr>
-        <w:keepNext w:val="0"/>
-        <w:widowControl/>
-        <w:tabs>
-          <w:tab w:pos="576" w:val="left"/>
-        </w:tabs>
-        <w:spacing w:before="0" w:after="60" w:line="360" w:lineRule="auto"/>
-        <w:ind w:left="576" w:hanging="576"/>
-        <w:jc w:val="left"/>
-      </w:pPr>
-      <w:r>
-        <w:rPr>
-          <w:rFonts w:ascii="Times New Roman" w:hAnsi="Times New Roman" w:cs="Times New Roman" w:eastAsia="Times New Roman"/>
-          <w:b w:val="0"/>
-          <w:i w:val="0"/>
-          <w:sz w:val="24"/>
-        </w:rPr>
-        <w:t>20.</w:t>
-        <w:tab/>
-        <w:t>Geifman, Y., El-Yaniv, R.: Selective classification for deep neural networks. In: Advances in Neural Information Processing Systems, vol. 30, pp. 4878–4887 (2017)</w:t>
-      </w:r>
-    </w:p>
-    <w:p>
-      <w:pPr>
-        <w:keepNext w:val="0"/>
-        <w:widowControl/>
-        <w:tabs>
-          <w:tab w:pos="576" w:val="left"/>
-        </w:tabs>
-        <w:spacing w:before="0" w:after="60" w:line="360" w:lineRule="auto"/>
-        <w:ind w:left="576" w:hanging="576"/>
-        <w:jc w:val="left"/>
-      </w:pPr>
-      <w:r>
-        <w:rPr>
-          <w:rFonts w:ascii="Times New Roman" w:hAnsi="Times New Roman" w:cs="Times New Roman" w:eastAsia="Times New Roman"/>
-          <w:b w:val="0"/>
-          <w:i w:val="0"/>
-          <w:sz w:val="24"/>
-        </w:rPr>
-        <w:t>21.</w:t>
-        <w:tab/>
-        <w:t>Jeffreys, H.: Theory of Probability, 3rd edn. Clarendon Press, Oxford (1961)</w:t>
+        <w:t>, 3073–3110 (2024). https://arxiv.org/abs/2107.11277</w:t>
       </w:r>
     </w:p>
     <w:sectPr>

</xml_diff>